<commit_message>
Release M20.1 network-verified provenance update
</commit_message>
<xml_diff>
--- a/submission_package/stage22_m20_review_response/cover_letter.docx
+++ b/submission_package/stage22_m20_review_response/cover_letter.docx
@@ -58,7 +58,7 @@
         <w:pStyle w:val="BodyText"/>
       </w:pPr>
       <w:r>
-        <w:t xml:space="preserve">This revision directly addresses exchangeability, platform-dependent pathway membership and maxT scaling by using sex-restricted or exact allocations, common measurable genes, studentized maxT, 100,000 Monte Carlo allocations where enumeration was infeasible, bootstrap uncertainty and leave-one-source-out analysis. It adds a complete PRISMA 2020 checklist, source-level risk/confounding and ethics provenance, formal GEO data citations, a comparison with prior DKD integrations, and a self-contained code archive tested from extraction. Unresolved ethics fields are reported transparently rather than inferred.</w:t>
+        <w:t xml:space="preserve">This revision directly addresses exchangeability, platform-dependent pathway membership and maxT scaling by using sex-restricted or exact allocations, common measurable genes, studentized maxT, 100,000 Monte Carlo allocations where enumeration was infeasible, bootstrap uncertainty and leave-one-source-out analysis. It adds a complete PRISMA 2020 checklist, source-level risk/confounding and ethics provenance, formal GEO data citations, a comparison with the closest prior DKD integrations, and a self-contained code archive tested from extraction. Exact repeated H7 donor labels between GSE99339 and GSE104948 are tabulated, and historical GSE47183/GSE32591 lineage declared by GEO is mapped. Unresolved ethics fields are reported transparently rather than inferred.</w:t>
       </w:r>
     </w:p>
     <w:p>
@@ -76,7 +76,7 @@
           <w:rPr>
             <w:rStyle w:val="Hyperlink"/>
           </w:rPr>
-          <w:t xml:space="preserve">https://github.com/denglizhen-113/dkd-focused-universe-reanalysis/tree/v1.2.0</w:t>
+          <w:t xml:space="preserve">https://github.com/denglizhen-113/dkd-focused-universe-reanalysis/tree/v1.2.1</w:t>
         </w:r>
       </w:hyperlink>
       <w:r>
@@ -86,6 +86,66 @@
     <w:p>
       <w:pPr>
         <w:pStyle w:val="BodyText"/>
+      </w:pPr>
+      <w:r>
+        <w:t xml:space="preserve">Required author declarations before upload:</w:t>
+      </w:r>
+    </w:p>
+    <w:p>
+      <w:pPr>
+        <w:pStyle w:val="Compact"/>
+        <w:numPr>
+          <w:ilvl w:val="0"/>
+          <w:numId w:val="1001"/>
+        </w:numPr>
+      </w:pPr>
+      <w:r>
+        <w:t xml:space="preserve">Suggested reviewers, with affiliation, institutional email and brief suitability rationale: [AUTHOR TO COMPLETE; identities and conflicts cannot be inferred from public records alone].</w:t>
+      </w:r>
+    </w:p>
+    <w:p>
+      <w:pPr>
+        <w:pStyle w:val="Compact"/>
+        <w:numPr>
+          <w:ilvl w:val="0"/>
+          <w:numId w:val="1001"/>
+        </w:numPr>
+      </w:pPr>
+      <w:r>
+        <w:t xml:space="preserve">Referees to exclude, with reason if applicable: [AUTHOR TO CONFIRM; none is not assumed].</w:t>
+      </w:r>
+    </w:p>
+    <w:p>
+      <w:pPr>
+        <w:pStyle w:val="Compact"/>
+        <w:numPr>
+          <w:ilvl w:val="0"/>
+          <w:numId w:val="1001"/>
+        </w:numPr>
+      </w:pPr>
+      <w:r>
+        <w:t xml:space="preserve">Any prior discussion of this study with a</w:t>
+      </w:r>
+      <w:r>
+        <w:t xml:space="preserve"> </w:t>
+      </w:r>
+      <w:r>
+        <w:rPr>
+          <w:i/>
+          <w:iCs/>
+        </w:rPr>
+        <w:t xml:space="preserve">Scientific Reports</w:t>
+      </w:r>
+      <w:r>
+        <w:t xml:space="preserve"> </w:t>
+      </w:r>
+      <w:r>
+        <w:t xml:space="preserve">Editorial Board Member: [AUTHOR TO CONFIRM; none is not assumed].</w:t>
+      </w:r>
+    </w:p>
+    <w:p>
+      <w:pPr>
+        <w:pStyle w:val="FirstParagraph"/>
       </w:pPr>
       <w:r>
         <w:t xml:space="preserve">Sincerely,</w:t>
@@ -258,8 +318,114 @@
       </w:pPr>
     </w:lvl>
   </w:abstractNum>
+  <w:abstractNum w:abstractNumId="991">
+    <w:nsid w:val="0000A991"/>
+    <w:multiLevelType w:val="multilevel"/>
+    <w:lvl w:ilvl="0">
+      <w:numFmt w:val="bullet"/>
+      <w:lvlText w:val=""/>
+      <w:lvlJc w:val="left"/>
+      <w:pPr>
+        <w:ind w:left="720" w:hanging="360"/>
+      </w:pPr>
+      <w:rPr>
+        <w:rFonts w:ascii="Symbol" w:hAnsi="Symbol" w:cs="Symbol" w:hint="default"/>
+      </w:rPr>
+    </w:lvl>
+    <w:lvl w:ilvl="1">
+      <w:numFmt w:val="bullet"/>
+      <w:lvlText w:val="o"/>
+      <w:lvlJc w:val="left"/>
+      <w:pPr>
+        <w:ind w:left="1440" w:hanging="360"/>
+      </w:pPr>
+      <w:rPr>
+        <w:rFonts w:ascii="Courier New" w:hAnsi="Courier New" w:cs="Courier New" w:hint="default"/>
+      </w:rPr>
+    </w:lvl>
+    <w:lvl w:ilvl="2">
+      <w:numFmt w:val="bullet"/>
+      <w:lvlText w:val=""/>
+      <w:lvlJc w:val="left"/>
+      <w:pPr>
+        <w:ind w:left="2160" w:hanging="360"/>
+      </w:pPr>
+      <w:rPr>
+        <w:rFonts w:ascii="Wingdings" w:hAnsi="Wingdings" w:cs="Wingdings" w:hint="default"/>
+      </w:rPr>
+    </w:lvl>
+    <w:lvl w:ilvl="3">
+      <w:numFmt w:val="bullet"/>
+      <w:lvlText w:val=""/>
+      <w:lvlJc w:val="left"/>
+      <w:pPr>
+        <w:ind w:left="2880" w:hanging="360"/>
+      </w:pPr>
+      <w:rPr>
+        <w:rFonts w:ascii="Symbol" w:hAnsi="Symbol" w:cs="Symbol" w:hint="default"/>
+      </w:rPr>
+    </w:lvl>
+    <w:lvl w:ilvl="4">
+      <w:numFmt w:val="bullet"/>
+      <w:lvlText w:val="o"/>
+      <w:lvlJc w:val="left"/>
+      <w:pPr>
+        <w:ind w:left="3600" w:hanging="360"/>
+      </w:pPr>
+      <w:rPr>
+        <w:rFonts w:ascii="Courier New" w:hAnsi="Courier New" w:cs="Courier New" w:hint="default"/>
+      </w:rPr>
+    </w:lvl>
+    <w:lvl w:ilvl="5">
+      <w:numFmt w:val="bullet"/>
+      <w:lvlText w:val=""/>
+      <w:lvlJc w:val="left"/>
+      <w:pPr>
+        <w:ind w:left="4320" w:hanging="360"/>
+      </w:pPr>
+      <w:rPr>
+        <w:rFonts w:ascii="Wingdings" w:hAnsi="Wingdings" w:cs="Wingdings" w:hint="default"/>
+      </w:rPr>
+    </w:lvl>
+    <w:lvl w:ilvl="6">
+      <w:numFmt w:val="bullet"/>
+      <w:lvlText w:val=""/>
+      <w:lvlJc w:val="left"/>
+      <w:pPr>
+        <w:ind w:left="5040" w:hanging="360"/>
+      </w:pPr>
+      <w:rPr>
+        <w:rFonts w:ascii="Symbol" w:hAnsi="Symbol" w:cs="Symbol" w:hint="default"/>
+      </w:rPr>
+    </w:lvl>
+    <w:lvl w:ilvl="7">
+      <w:numFmt w:val="bullet"/>
+      <w:lvlText w:val="o"/>
+      <w:lvlJc w:val="left"/>
+      <w:pPr>
+        <w:ind w:left="5760" w:hanging="360"/>
+      </w:pPr>
+      <w:rPr>
+        <w:rFonts w:ascii="Courier New" w:hAnsi="Courier New" w:cs="Courier New" w:hint="default"/>
+      </w:rPr>
+    </w:lvl>
+    <w:lvl w:ilvl="8">
+      <w:numFmt w:val="bullet"/>
+      <w:lvlText w:val=""/>
+      <w:lvlJc w:val="left"/>
+      <w:pPr>
+        <w:ind w:left="6480" w:hanging="360"/>
+      </w:pPr>
+      <w:rPr>
+        <w:rFonts w:ascii="Wingdings" w:hAnsi="Wingdings" w:cs="Wingdings" w:hint="default"/>
+      </w:rPr>
+    </w:lvl>
+  </w:abstractNum>
   <w:num w:numId="1000">
     <w:abstractNumId w:val="990"/>
+  </w:num>
+  <w:num w:numId="1001">
+    <w:abstractNumId w:val="991"/>
   </w:num>
 </w:numbering>
 </file>

</xml_diff>